<commit_message>
docs: plain language review complete for chapter 5
</commit_message>
<xml_diff>
--- a/docs/thesis-chapter-5.docx
+++ b/docs/thesis-chapter-5.docx
@@ -47,7 +47,7 @@
           <w:i w:val="0"/>
           <w:sz w:val="24"/>
         </w:rPr>
-        <w:t>The system follows a multi-tier architecture in which the React single-page application (SPA) provides the presentation layer, the Express REST API provides the application layer, and MongoDB together with ChromaDB forms the data layer for metadata and vector storage. This separation supports independent evolution of the user interface, business logic, and persistence concerns while preserving a clear boundary between client and server responsibilities.</w:t>
+        <w:t>The system follows a multi-tier architecture in which the React single-page application (SPA) provides the presentation layer, the Express REST API provides the application layer, and MongoDB together with ChromaDB forms the data layer for metadata and vector storage. This separation supports independent evolution of the user interface, business logic, and data storage concerns while preserving a clear boundary between client and server responsibilities.</w:t>
       </w:r>
     </w:p>
     <w:p>
@@ -62,7 +62,7 @@
           <w:i w:val="0"/>
           <w:sz w:val="24"/>
         </w:rPr>
-        <w:t>Communication between layers occurs through Axios-based HTTPS requests that carry JSON Web Tokens (JWT) for authenticated access. Within the backend, requests pass through middleware for authentication, rate limiting, and organization scoping before entering the service layer that orchestrates embedding, retrieval, and external calls. The application integrates with external APIs for Gemini-based generation and Resend email delivery, while maintaining internal service abstractions for vector search and document processing.</w:t>
+        <w:t>Communication between layers occurs through HTTPS requests that carry a JWT (security token) to verify the caller's identity. Within the backend, requests pass through middleware for authentication checks, usage limiting, and organization context before reaching the service layer that coordinates document indexing, search, and external API calls. The application integrates with external APIs for Gemini-based generation and Resend email delivery, while maintaining dedicated internal services for semantic search and document processing.</w:t>
       </w:r>
     </w:p>
     <w:p>
@@ -77,7 +77,7 @@
           <w:i w:val="0"/>
           <w:sz w:val="24"/>
         </w:rPr>
-        <w:t>The deployment topology places the React frontend on Vercel, the Express backend and ChromaDB services on Render, and the document metadata database on MongoDB Atlas. This layout aligns stateless web services with managed infrastructure, enabling scalable delivery of the application while preserving separation between compute and managed persistence.</w:t>
+        <w:t>The deployment topology places the React frontend on Vercel, the Express backend and ChromaDB services on Render, and the document metadata database on MongoDB Atlas. This layout separates application processing from data storage, allowing each component to scale independently while keeping infrastructure management overhead low.</w:t>
       </w:r>
     </w:p>
     <w:p>
@@ -539,7 +539,7 @@
                 <w:i w:val="0"/>
                 <w:sz w:val="24"/>
               </w:rPr>
-              <w:t>Required, Unique, Lowercase, Trim</w:t>
+              <w:t>Required, Unique, Lowercase, whitespace stripped</w:t>
             </w:r>
           </w:p>
         </w:tc>
@@ -847,7 +847,7 @@
                 <w:i w:val="0"/>
                 <w:sz w:val="24"/>
               </w:rPr>
-              <w:t>Avatar image (base64)</w:t>
+              <w:t>Avatar image stored as a base64-encoded string</w:t>
             </w:r>
           </w:p>
         </w:tc>
@@ -1629,7 +1629,7 @@
                 <w:i w:val="0"/>
                 <w:sz w:val="24"/>
               </w:rPr>
-              <w:t>Detected MIME type</w:t>
+              <w:t>Detected file format (MIME type)</w:t>
             </w:r>
           </w:p>
         </w:tc>
@@ -2841,7 +2841,7 @@
                 <w:i w:val="0"/>
                 <w:sz w:val="24"/>
               </w:rPr>
-              <w:t>Embedded schema; role enum user|assistant, content required</w:t>
+              <w:t>Nested object array; role must be user or assistant, content required</w:t>
             </w:r>
           </w:p>
         </w:tc>
@@ -5401,7 +5401,7 @@
           <w:i w:val="0"/>
           <w:sz w:val="24"/>
         </w:rPr>
-        <w:t>User registration begins when credentials are submitted to the authentication endpoint, where the password is hashed and a new user record is stored before a JSON Web Token (JWT) is signed and returned. Login validates credentials against stored hashes, issues a fresh JWT, and returns the token for subsequent authenticated requests. After login, protected requests traverse the middleware chain in sequence: request handling, authMiddleware for token verification, orgMiddleware to attach organization context, and then the relevant controller for business logic execution.</w:t>
+        <w:t>User registration begins when credentials are submitted to the authentication endpoint, where the password is hashed and a new user record is stored before a JSON Web Token (JWT) is signed and returned. Login validates credentials against stored hashes, issues a fresh JWT, and returns the token for subsequent authenticated requests. After login, protected requests pass through a series of checks in sequence — token verification, organization context resolution, and role validation — before reaching the relevant handler.</w:t>
       </w:r>
     </w:p>
     <w:p>
@@ -5447,7 +5447,7 @@
           <w:i w:val="0"/>
           <w:sz w:val="24"/>
         </w:rPr>
-        <w:t>When an administrator uploads a file, Multer handles multipart ingestion and the file is stored before a MongoDB document record is created with status set to processing. The embedding process runs asynchronously: text is extracted using pdf-parse, mammoth, or xlsx, cleaned, and split by RecursiveCharacterTextSplitter into 1500-character chunks with 200-character overlap, then filtered by isValidChunk. Chunks are embedded in batches of two via the Gemini REST API with retry and adaptive delays, upserted to ChromaDB, and the document status is updated to ready upon completion.</w:t>
+        <w:t>When an administrator uploads a file, the file upload handler receives and stores the file before a MongoDB document record is created with status set to processing. The embedding process runs asynchronously: text is extracted from the file, cleaned, and split into 1500-character segments with 200-character overlap, then filtered to remove low-quality sections. Sections are processed in batches of two via the Gemini API with automatic retries and adaptive delays, stored in the search database, and the document status is updated to ready upon completion.</w:t>
       </w:r>
     </w:p>
     <w:p>
@@ -5493,7 +5493,7 @@
           <w:i w:val="0"/>
           <w:sz w:val="24"/>
         </w:rPr>
-        <w:t>A query request first checks the in-memory cache with a five-minute time-to-live; on a miss, the query is expanded into two alternative phrasings. All three queries are embedded and used to retrieve the top five chunks per phrasing from ChromaDB, then deduplicated by content prefix to select the top eight unique chunks. The system injects the last four conversation messages into the prompt context, calls Gemini 2.5 Flash to generate the answer, and returns the response with source citations for traceability.</w:t>
+        <w:t>A query request first checks the an in-memory cache with a five-minute expiry; on a miss, the query is expanded into two alternative phrasings. All three queries are converted to numerical representations and used to retrieve the top five sections per phrasing from ChromaDB, then deduplicated to select the top eight unique sections. The system injects the last four conversation messages into the prompt context, calls Gemini 2.5 Flash to generate the answer, and returns the response with source citations for traceability.</w:t>
       </w:r>
     </w:p>
     <w:p>
@@ -5555,7 +5555,7 @@
           <w:i w:val="0"/>
           <w:sz w:val="24"/>
         </w:rPr>
-        <w:t>The frontend is built with React 19, which provides a component-based architecture suited for modular UI composition, and Vite as the build tool for fast development and optimized production bundles. Tailwind CSS v4 is used for utility-first styling with @theme tokens, enabling consistent visual language across the interface. React Router v7 manages nested protected routes, while Axios provides a centralized API client with JWT request interception and 401 response handling. In the chat interface, react-markdown is used for rendering assistant responses, with GitHub-flavored markdown support via remark-gfm to preserve lists and tables.</w:t>
+        <w:t>The frontend is built with React 19, which provides a component-based architecture suited for modular UI composition, and Vite as the build tool for fast development and optimized production bundles. Tailwind CSS v4 is used for utility-first styling with design tokens, enabling a consistent visual language across the interface. React Router v7 manages page navigation with access control based on login status, while Axios provides a centralized HTTP client that automatically attaches security tokens to requests and handles session expiry. In the chat interface, a markdown rendering library is used to display assistant responses with support for lists, tables, and code formatting.</w:t>
       </w:r>
     </w:p>
     <w:p>
@@ -5601,7 +5601,7 @@
           <w:i w:val="0"/>
           <w:sz w:val="24"/>
         </w:rPr>
-        <w:t>The Onboarding page supports organization creation or joining flows, providing the primary entry point for tenancy setup before access to core features. It routes users to organization context once an organization is created or an invite code is accepted.</w:t>
+        <w:t>The Onboarding page supports organization creation or joining flows, providing the primary entry point for workspace setup before access to core features. It routes users to organization context once an organization is created or an invite code is accepted.</w:t>
       </w:r>
     </w:p>
     <w:p>
@@ -5616,7 +5616,7 @@
           <w:i w:val="0"/>
           <w:sz w:val="24"/>
         </w:rPr>
-        <w:t>The Chat page combines a conversation sidebar, a message thread with markdown rendering, a source citation accordion, and a typing indicator to communicate response status. It also exposes conversation headers with document chips to clarify the active retrieval scope during question answering.</w:t>
+        <w:t>The Chat page combines a conversation sidebar, a message thread with markdown rendering, a source citation accordion, and a typing indicator to communicate response status. It also exposes conversation headers with document tags to indicate which documents are currently being searched during question answering.</w:t>
       </w:r>
     </w:p>
     <w:p>
@@ -5677,7 +5677,7 @@
           <w:i w:val="0"/>
           <w:sz w:val="24"/>
         </w:rPr>
-        <w:t>The interface uses a glass card design system with a dark aesthetic, backdrop blur, radial gradient orbs, and starfield backgrounds to maintain visual coherence across screens. Authentication relies on a JWT flow where tokens are stored in localStorage, decoded on mount, and refreshed via a 401 interceptor that redirects unauthenticated users to login. Avatar updates are stored under the archon_avatar localStorage key and broadcast through an auth-updated custom event to synchronize UI state across components. Document processing status is polled every three seconds while in processing state, and a toast notification system provides immediate feedback for success and error conditions.</w:t>
+        <w:t>The interface uses a glass card design system with a dark aesthetic, backdrop blur, radial gradient orbs, and starfield backgrounds to maintain visual coherence across screens. Authentication tokens are stored in the browser and verified on each page load. If a token is expired or missing, the user is redirected to the login page automatically. Avatar and display name updates are reflected immediately across all interface components without requiring a page reload. Document processing status is checked every three seconds while a document is being indexed, and a toast notification system provides immediate feedback for success and error conditions. </w:t>
       </w:r>
     </w:p>
     <w:p>

</xml_diff>